<commit_message>
preenchimento dos fluxos principais
</commit_message>
<xml_diff>
--- a/Sleep_street.docx
+++ b/Sleep_street.docx
@@ -8220,8 +8220,13 @@
             </w:pPr>
             <w:r>
               <w:rPr>
-                <w:rtl w:val="0"/>
-              </w:rPr>
+                <w:b w:val="1"/>
+                <w:bCs w:val="1"/>
+                <w:sz w:val="24"/>
+                <w:szCs w:val="24"/>
+                <w:rtl w:val="0"/>
+              </w:rPr>
+              <w:t xml:space="preserve">emanuel carvalho </w:t>
             </w:r>
           </w:p>
         </w:tc>
@@ -8367,16 +8372,6 @@
           </w:p>
           <w:p>
             <w:pPr>
-              <w:rPr/>
-            </w:pPr>
-            <w:r>
-              <w:rPr>
-                <w:rtl w:val="0"/>
-              </w:rPr>
-            </w:r>
-          </w:p>
-          <w:p>
-            <w:pPr>
               <w:widowControl w:val="0"/>
               <w:spacing w:line="240" w:lineRule="auto"/>
               <w:rPr>
@@ -8917,6 +8912,61 @@
           </w:p>
           <w:p>
             <w:pPr>
+              <w:rPr/>
+            </w:pPr>
+            <w:r>
+              <w:rPr>
+                <w:rtl w:val="0"/>
+              </w:rPr>
+              <w:t xml:space="preserve">16. O sistema atualiza o total da viagem.</w:t>
+            </w:r>
+          </w:p>
+          <w:p>
+            <w:pPr>
+              <w:rPr/>
+            </w:pPr>
+            <w:r>
+              <w:rPr>
+                <w:rtl w:val="0"/>
+              </w:rPr>
+              <w:t xml:space="preserve">17. O usuário acessa a aba "Configurações da viagem".</w:t>
+            </w:r>
+          </w:p>
+          <w:p>
+            <w:pPr>
+              <w:rPr/>
+            </w:pPr>
+            <w:r>
+              <w:rPr>
+                <w:rtl w:val="0"/>
+              </w:rPr>
+              <w:t xml:space="preserve">18. Escolha "Lazer" ou "Negócios".</w:t>
+            </w:r>
+          </w:p>
+          <w:p>
+            <w:pPr>
+              <w:rPr/>
+            </w:pPr>
+            <w:r>
+              <w:rPr>
+                <w:rtl w:val="0"/>
+              </w:rPr>
+              <w:t xml:space="preserve">19. Salva.</w:t>
+            </w:r>
+          </w:p>
+          <w:p>
+            <w:pPr>
+              <w:rPr/>
+            </w:pPr>
+            <w:r>
+              <w:rPr>
+                <w:rtl w:val="0"/>
+              </w:rPr>
+              <w:t xml:space="preserve">20. O sistema atualiza a lista de bagagem e sugestões.</w:t>
+            </w:r>
+          </w:p>
+          <w:p>
+            <w:pPr>
               <w:widowControl w:val="0"/>
               <w:spacing w:line="240" w:lineRule="auto"/>
               <w:rPr>
@@ -8984,12 +9034,10 @@
           </w:tcPr>
           <w:p>
             <w:pPr>
-              <w:widowControl w:val="0"/>
               <w:numPr>
                 <w:ilvl w:val="0"/>
                 <w:numId w:val="5"/>
               </w:numPr>
-              <w:spacing w:line="240" w:lineRule="auto"/>
               <w:ind w:left="720" w:hanging="360"/>
               <w:rPr>
                 <w:sz w:val="24"/>
@@ -9000,17 +9048,46 @@
               <w:rPr>
                 <w:rtl w:val="0"/>
               </w:rPr>
-            </w:r>
-          </w:p>
-          <w:p>
-            <w:pPr>
-              <w:widowControl w:val="0"/>
-              <w:spacing w:line="240" w:lineRule="auto"/>
-              <w:rPr>
-                <w:sz w:val="24"/>
-                <w:szCs w:val="24"/>
-              </w:rPr>
-            </w:pPr>
+              <w:t xml:space="preserve">- FA01 - Dados inválidos: exibe erros em tempo real e não salva.</w:t>
+            </w:r>
+          </w:p>
+          <w:p>
+            <w:pPr>
+              <w:numPr>
+                <w:ilvl w:val="0"/>
+                <w:numId w:val="5"/>
+              </w:numPr>
+              <w:ind w:left="720" w:hanging="360"/>
+              <w:rPr>
+                <w:sz w:val="24"/>
+                <w:szCs w:val="24"/>
+              </w:rPr>
+            </w:pPr>
+            <w:r>
+              <w:rPr>
+                <w:rtl w:val="0"/>
+              </w:rPr>
+              <w:t xml:space="preserve">- FA02 - Usuário clica em "Cancelar": exibe confirmação de cancelamento.</w:t>
+            </w:r>
+          </w:p>
+          <w:p>
+            <w:pPr>
+              <w:numPr>
+                <w:ilvl w:val="0"/>
+                <w:numId w:val="5"/>
+              </w:numPr>
+              <w:ind w:left="720" w:hanging="360"/>
+              <w:rPr>
+                <w:sz w:val="24"/>
+                <w:szCs w:val="24"/>
+              </w:rPr>
+            </w:pPr>
+            <w:r>
+              <w:rPr>
+                <w:rtl w:val="0"/>
+              </w:rPr>
+              <w:t xml:space="preserve">- FA03 - Senha fraca ou inválida: validação em tempo real e solicitação de nova senha forte.</w:t>
+            </w:r>
             <w:r>
               <w:rPr>
                 <w:rtl w:val="0"/>
@@ -9252,6 +9329,21 @@
         </w:tc>
       </w:tr>
     </w:tbl>
+    <w:p>
+      <w:pPr>
+        <w:spacing w:line="360" w:lineRule="auto"/>
+        <w:jc w:val="both"/>
+        <w:rPr>
+          <w:sz w:val="24"/>
+          <w:szCs w:val="24"/>
+        </w:rPr>
+      </w:pPr>
+      <w:r>
+        <w:rPr>
+          <w:rtl w:val="0"/>
+        </w:rPr>
+      </w:r>
+    </w:p>
     <w:p>
       <w:pPr>
         <w:spacing w:line="360" w:lineRule="auto"/>

</xml_diff>

<commit_message>
preenchimento do fluxo execeçao e correçao ortografia
</commit_message>
<xml_diff>
--- a/Sleep_street.docx
+++ b/Sleep_street.docx
@@ -548,22 +548,61 @@
       </w:pPr>
       <w:r>
         <w:rPr>
-          <w:rFonts w:ascii="Arial" w:cs="Arial" w:eastAsia="Arial" w:hAnsi="Arial"/>
           <w:b w:val="1"/>
           <w:bCs w:val="1"/>
-          <w:i w:val="0"/>
-          <w:iCs w:val="0"/>
-          <w:smallCaps w:val="0"/>
-          <w:strike w:val="0"/>
-          <w:color w:val="000000"/>
-          <w:sz w:val="24"/>
-          <w:szCs w:val="24"/>
-          <w:u w:val="none"/>
-          <w:shd w:fill="auto" w:val="clear"/>
-          <w:vertAlign w:val="baseline"/>
-          <w:rtl w:val="0"/>
-        </w:rPr>
-        <w:t xml:space="preserve">Dhaniel Moreira - Analista de Requisitos / PO Gabriel Henrique de Lima Ferreira - Backend Developer / QA </w:t>
+          <w:sz w:val="24"/>
+          <w:szCs w:val="24"/>
+          <w:rtl w:val="0"/>
+        </w:rPr>
+        <w:t xml:space="preserve">Daniel</w:t>
+      </w:r>
+      <w:r>
+        <w:rPr>
+          <w:rFonts w:ascii="Arial" w:cs="Arial" w:eastAsia="Arial" w:hAnsi="Arial"/>
+          <w:b w:val="1"/>
+          <w:bCs w:val="1"/>
+          <w:i w:val="0"/>
+          <w:iCs w:val="0"/>
+          <w:smallCaps w:val="0"/>
+          <w:strike w:val="0"/>
+          <w:color w:val="000000"/>
+          <w:sz w:val="24"/>
+          <w:szCs w:val="24"/>
+          <w:u w:val="none"/>
+          <w:shd w:fill="auto" w:val="clear"/>
+          <w:vertAlign w:val="baseline"/>
+          <w:rtl w:val="0"/>
+        </w:rPr>
+        <w:t xml:space="preserve"> Moreira - Analista de Requisitos / </w:t>
+      </w:r>
+      <w:r>
+        <w:rPr>
+          <w:b w:val="1"/>
+          <w:bCs w:val="1"/>
+          <w:sz w:val="24"/>
+          <w:szCs w:val="24"/>
+          <w:rtl w:val="0"/>
+        </w:rPr>
+        <w:t xml:space="preserve">POR Gabriel</w:t>
+      </w:r>
+      <w:r>
+        <w:rPr>
+          <w:rFonts w:ascii="Arial" w:cs="Arial" w:eastAsia="Arial" w:hAnsi="Arial"/>
+          <w:b w:val="1"/>
+          <w:bCs w:val="1"/>
+          <w:i w:val="0"/>
+          <w:iCs w:val="0"/>
+          <w:smallCaps w:val="0"/>
+          <w:strike w:val="0"/>
+          <w:color w:val="000000"/>
+          <w:sz w:val="24"/>
+          <w:szCs w:val="24"/>
+          <w:u w:val="none"/>
+          <w:shd w:fill="auto" w:val="clear"/>
+          <w:vertAlign w:val="baseline"/>
+          <w:rtl w:val="0"/>
+        </w:rPr>
+        <w:t xml:space="preserve"> Henrique de Lima Ferreira - Backend Developer / QA </w:t>
       </w:r>
     </w:p>
     <w:p>
@@ -8441,7 +8480,7 @@
             <w:pPr>
               <w:numPr>
                 <w:ilvl w:val="0"/>
-                <w:numId w:val="3"/>
+                <w:numId w:val="2"/>
               </w:numPr>
               <w:ind w:left="720" w:hanging="360"/>
               <w:rPr>
@@ -8459,7 +8498,7 @@
             <w:pPr>
               <w:numPr>
                 <w:ilvl w:val="0"/>
-                <w:numId w:val="3"/>
+                <w:numId w:val="2"/>
               </w:numPr>
               <w:ind w:left="720" w:hanging="360"/>
               <w:rPr>
@@ -8477,7 +8516,7 @@
             <w:pPr>
               <w:numPr>
                 <w:ilvl w:val="0"/>
-                <w:numId w:val="3"/>
+                <w:numId w:val="2"/>
               </w:numPr>
               <w:ind w:left="720" w:hanging="360"/>
               <w:rPr>
@@ -8495,7 +8534,7 @@
             <w:pPr>
               <w:numPr>
                 <w:ilvl w:val="0"/>
-                <w:numId w:val="3"/>
+                <w:numId w:val="2"/>
               </w:numPr>
               <w:ind w:left="720" w:hanging="360"/>
               <w:rPr>
@@ -8513,7 +8552,7 @@
             <w:pPr>
               <w:numPr>
                 <w:ilvl w:val="0"/>
-                <w:numId w:val="3"/>
+                <w:numId w:val="2"/>
               </w:numPr>
               <w:ind w:left="720" w:hanging="360"/>
               <w:rPr>
@@ -8588,7 +8627,7 @@
             <w:pPr>
               <w:numPr>
                 <w:ilvl w:val="0"/>
-                <w:numId w:val="4"/>
+                <w:numId w:val="3"/>
               </w:numPr>
               <w:ind w:left="720" w:hanging="360"/>
               <w:rPr>
@@ -8607,7 +8646,7 @@
             <w:pPr>
               <w:numPr>
                 <w:ilvl w:val="0"/>
-                <w:numId w:val="4"/>
+                <w:numId w:val="3"/>
               </w:numPr>
               <w:ind w:left="720" w:hanging="360"/>
               <w:rPr>
@@ -8626,7 +8665,7 @@
             <w:pPr>
               <w:numPr>
                 <w:ilvl w:val="0"/>
-                <w:numId w:val="4"/>
+                <w:numId w:val="3"/>
               </w:numPr>
               <w:ind w:left="720" w:hanging="360"/>
               <w:rPr>
@@ -8645,7 +8684,7 @@
             <w:pPr>
               <w:numPr>
                 <w:ilvl w:val="0"/>
-                <w:numId w:val="4"/>
+                <w:numId w:val="3"/>
               </w:numPr>
               <w:ind w:left="720" w:hanging="360"/>
               <w:rPr>
@@ -8664,7 +8703,7 @@
             <w:pPr>
               <w:numPr>
                 <w:ilvl w:val="0"/>
-                <w:numId w:val="4"/>
+                <w:numId w:val="3"/>
               </w:numPr>
               <w:ind w:left="720" w:hanging="360"/>
               <w:rPr>
@@ -9036,7 +9075,7 @@
             <w:pPr>
               <w:numPr>
                 <w:ilvl w:val="0"/>
-                <w:numId w:val="5"/>
+                <w:numId w:val="4"/>
               </w:numPr>
               <w:ind w:left="720" w:hanging="360"/>
               <w:rPr>
@@ -9055,7 +9094,7 @@
             <w:pPr>
               <w:numPr>
                 <w:ilvl w:val="0"/>
-                <w:numId w:val="5"/>
+                <w:numId w:val="4"/>
               </w:numPr>
               <w:ind w:left="720" w:hanging="360"/>
               <w:rPr>
@@ -9074,7 +9113,7 @@
             <w:pPr>
               <w:numPr>
                 <w:ilvl w:val="0"/>
-                <w:numId w:val="5"/>
+                <w:numId w:val="4"/>
               </w:numPr>
               <w:ind w:left="720" w:hanging="360"/>
               <w:rPr>
@@ -9148,50 +9187,28 @@
           </w:tcPr>
           <w:p>
             <w:pPr>
-              <w:widowControl w:val="0"/>
-              <w:spacing w:line="240" w:lineRule="auto"/>
-              <w:rPr>
-                <w:b w:val="1"/>
-                <w:bCs w:val="1"/>
-                <w:sz w:val="24"/>
-                <w:szCs w:val="24"/>
-              </w:rPr>
-            </w:pPr>
-            <w:r>
-              <w:rPr>
-                <w:rtl w:val="0"/>
-              </w:rPr>
-            </w:r>
-          </w:p>
-          <w:p>
-            <w:pPr>
-              <w:widowControl w:val="0"/>
-              <w:spacing w:line="240" w:lineRule="auto"/>
-              <w:rPr>
-                <w:sz w:val="24"/>
-                <w:szCs w:val="24"/>
-              </w:rPr>
-            </w:pPr>
-            <w:r>
-              <w:rPr>
-                <w:rtl w:val="0"/>
-              </w:rPr>
-            </w:r>
-          </w:p>
-          <w:p>
-            <w:pPr>
-              <w:widowControl w:val="0"/>
-              <w:numPr>
-                <w:ilvl w:val="0"/>
-                <w:numId w:val="2"/>
-              </w:numPr>
-              <w:spacing w:line="240" w:lineRule="auto"/>
-              <w:ind w:left="720" w:hanging="360"/>
-              <w:rPr>
-                <w:sz w:val="24"/>
-                <w:szCs w:val="24"/>
-              </w:rPr>
-            </w:pPr>
+              <w:rPr/>
+            </w:pPr>
+            <w:r>
+              <w:rPr>
+                <w:rtl w:val="0"/>
+              </w:rPr>
+              <w:t xml:space="preserve">- FE01 - Falha na API de localização: exibe erro "Verifique sua conexão".</w:t>
+            </w:r>
+          </w:p>
+          <w:p>
+            <w:pPr>
+              <w:rPr>
+                <w:sz w:val="24"/>
+                <w:szCs w:val="24"/>
+              </w:rPr>
+            </w:pPr>
+            <w:r>
+              <w:rPr>
+                <w:rtl w:val="0"/>
+              </w:rPr>
+              <w:t xml:space="preserve">  FE02 - Falha no servidor: exibe erro "Tente novamente".</w:t>
+            </w:r>
             <w:r>
               <w:rPr>
                 <w:rtl w:val="0"/>
@@ -9282,17 +9299,12 @@
               </w:rPr>
               <w:t xml:space="preserve"> </w:t>
             </w:r>
-          </w:p>
-          <w:p>
-            <w:pPr>
-              <w:widowControl w:val="0"/>
-              <w:spacing w:line="240" w:lineRule="auto"/>
-              <w:ind w:left="720" w:firstLine="0"/>
-              <w:rPr>
-                <w:sz w:val="24"/>
-                <w:szCs w:val="24"/>
-              </w:rPr>
-            </w:pPr>
+            <w:r>
+              <w:rPr>
+                <w:rtl w:val="0"/>
+              </w:rPr>
+              <w:t xml:space="preserve">- RN01 - Valor total sempre inclui todos os gastos.</w:t>
+            </w:r>
             <w:r>
               <w:rPr>
                 <w:rtl w:val="0"/>
@@ -9868,116 +9880,6 @@
       </w:rPr>
     </w:lvl>
   </w:abstractNum>
-  <w:abstractNum w:abstractNumId="5">
-    <w:lvl w:ilvl="0">
-      <w:start w:val="1"/>
-      <w:numFmt w:val="bullet"/>
-      <w:lvlText w:val="●"/>
-      <w:lvlJc w:val="left"/>
-      <w:pPr>
-        <w:ind w:left="720" w:hanging="360"/>
-      </w:pPr>
-      <w:rPr>
-        <w:u w:val="none"/>
-      </w:rPr>
-    </w:lvl>
-    <w:lvl w:ilvl="1">
-      <w:start w:val="1"/>
-      <w:numFmt w:val="bullet"/>
-      <w:lvlText w:val="○"/>
-      <w:lvlJc w:val="left"/>
-      <w:pPr>
-        <w:ind w:left="1440" w:hanging="360"/>
-      </w:pPr>
-      <w:rPr>
-        <w:u w:val="none"/>
-      </w:rPr>
-    </w:lvl>
-    <w:lvl w:ilvl="2">
-      <w:start w:val="1"/>
-      <w:numFmt w:val="bullet"/>
-      <w:lvlText w:val="■"/>
-      <w:lvlJc w:val="left"/>
-      <w:pPr>
-        <w:ind w:left="2160" w:hanging="360"/>
-      </w:pPr>
-      <w:rPr>
-        <w:u w:val="none"/>
-      </w:rPr>
-    </w:lvl>
-    <w:lvl w:ilvl="3">
-      <w:start w:val="1"/>
-      <w:numFmt w:val="bullet"/>
-      <w:lvlText w:val="●"/>
-      <w:lvlJc w:val="left"/>
-      <w:pPr>
-        <w:ind w:left="2880" w:hanging="360"/>
-      </w:pPr>
-      <w:rPr>
-        <w:u w:val="none"/>
-      </w:rPr>
-    </w:lvl>
-    <w:lvl w:ilvl="4">
-      <w:start w:val="1"/>
-      <w:numFmt w:val="bullet"/>
-      <w:lvlText w:val="○"/>
-      <w:lvlJc w:val="left"/>
-      <w:pPr>
-        <w:ind w:left="3600" w:hanging="360"/>
-      </w:pPr>
-      <w:rPr>
-        <w:u w:val="none"/>
-      </w:rPr>
-    </w:lvl>
-    <w:lvl w:ilvl="5">
-      <w:start w:val="1"/>
-      <w:numFmt w:val="bullet"/>
-      <w:lvlText w:val="■"/>
-      <w:lvlJc w:val="left"/>
-      <w:pPr>
-        <w:ind w:left="4320" w:hanging="360"/>
-      </w:pPr>
-      <w:rPr>
-        <w:u w:val="none"/>
-      </w:rPr>
-    </w:lvl>
-    <w:lvl w:ilvl="6">
-      <w:start w:val="1"/>
-      <w:numFmt w:val="bullet"/>
-      <w:lvlText w:val="●"/>
-      <w:lvlJc w:val="left"/>
-      <w:pPr>
-        <w:ind w:left="5040" w:hanging="360"/>
-      </w:pPr>
-      <w:rPr>
-        <w:u w:val="none"/>
-      </w:rPr>
-    </w:lvl>
-    <w:lvl w:ilvl="7">
-      <w:start w:val="1"/>
-      <w:numFmt w:val="bullet"/>
-      <w:lvlText w:val="○"/>
-      <w:lvlJc w:val="left"/>
-      <w:pPr>
-        <w:ind w:left="5760" w:hanging="360"/>
-      </w:pPr>
-      <w:rPr>
-        <w:u w:val="none"/>
-      </w:rPr>
-    </w:lvl>
-    <w:lvl w:ilvl="8">
-      <w:start w:val="1"/>
-      <w:numFmt w:val="bullet"/>
-      <w:lvlText w:val="■"/>
-      <w:lvlJc w:val="left"/>
-      <w:pPr>
-        <w:ind w:left="6480" w:hanging="360"/>
-      </w:pPr>
-      <w:rPr>
-        <w:u w:val="none"/>
-      </w:rPr>
-    </w:lvl>
-  </w:abstractNum>
   <w:num w:numId="1">
     <w:abstractNumId w:val="1"/>
   </w:num>
@@ -9989,9 +9891,6 @@
   </w:num>
   <w:num w:numId="4">
     <w:abstractNumId w:val="4"/>
-  </w:num>
-  <w:num w:numId="5">
-    <w:abstractNumId w:val="5"/>
   </w:num>
 </w:numbering>
 </file>

</xml_diff>